<commit_message>
Modelo: frase do prejuízo nos blocos de concessão de dano moral
- ROTA 7: novo 2º parágrafo "Os autos atestam, precipuamente, um prejuízo
  de R$ [[[___]]] ([[[valor por extenso]]]), a ser contabilizado em
  liquidação."; o parágrafo da pessoa idosa passa a ser o 3º.
- ROTA 6: a mesma frase como último parágrafo do bloco.
- Instruções ### explicam o valor: prejuízo efetivo não prescrito.

Co-Authored-By: Claude Opus 5.5 <noreply@anthropic.com>
Claude-Session: https://claude.ai/code/session_013QDNUXax2KcndW1CBsMGWB
</commit_message>
<xml_diff>
--- a/MODELO UNIVERSAL - PROTOTIPO GERAL.docx
+++ b/MODELO UNIVERSAL - PROTOTIPO GERAL.docx
@@ -1916,7 +1916,7 @@
           <w:color w:val="006030"/>
           <w:sz w:val="22"/>
         </w:rPr>
-        <w:t>### ROTA 7 — Danos morais (concessão): rotas 2 a 5, havendo pedido e presente ao menos um gatilho da ROTA 7. Substitui o bloco "Danos morais" de rejeição acima. [[[idosa]]]: ajuste ou apague se a parte autora não for idosa; o segundo parágrafo só entra se ela for idosa (60 anos ou mais — Lei n. 10.741/2003). ###</w:t>
+        <w:t>### ROTA 7 — Danos morais (concessão): rotas 2 a 5, havendo pedido e presente ao menos um gatilho da ROTA 7. Substitui o bloco "Danos morais" de rejeição acima. [[[idosa]]]: ajuste ou apague se a parte autora não for idosa; o terceiro parágrafo só entra se ela for idosa (60 anos ou mais — Lei n. 10.741/2003). Em "Os autos atestam", R$ [[[___]]] é o prejuízo efetivo não prescrito: soma dos descontos/ cobranças comprovados nos autos e não alcançados pela prescrição, MENOS o valor creditado em conta da parte autora que será compensado (D3), com o valor por extenso. ###</w:t>
       </w:r>
     </w:p>
     <w:p>
@@ -1971,6 +1971,22 @@
           <w:color w:val="000000"/>
           <w:sz w:val="24"/>
         </w:rPr>
+        <w:t>Os autos atestam, precipuamente, um prejuízo de R$ [[[___]]] ([[[valor por extenso]]]), a ser contabilizado em liquidação.</w:t>
+      </w:r>
+    </w:p>
+    <w:p>
+      <w:pPr>
+        <w:spacing w:before="0" w:after="0" w:line="360" w:lineRule="auto"/>
+        <w:ind w:firstLine="709" w:left="0"/>
+        <w:jc w:val="both"/>
+      </w:pPr>
+      <w:r>
+        <w:rPr>
+          <w:rFonts w:ascii="Times New Roman" w:hAnsi="Times New Roman"/>
+          <w:b w:val="0"/>
+          <w:color w:val="000000"/>
+          <w:sz w:val="24"/>
+        </w:rPr>
         <w:t>[[[Não há como considerar-se mero dissabor ou simples inconveniente na retirada de parte dos valores destinados à manutenção da pessoa idosa, eis que nessa fase da vida as necessidades materiais se multiplicam enquanto a capacidade de resistência física e moral aos agravos sofridos resta sensivelmente diminuída. Tenha-se que a importância de preservar-se o idoso das investidas injustas e de qualquer tipo de negligência foi sentida pelo legislado, que estabeleceu um estatuto próprio para as pessoas dessa faixa etária, visando à sua proteção integral (Lei n. 10.741/2003).]]]</w:t>
       </w:r>
     </w:p>
@@ -2074,7 +2090,7 @@
           <w:color w:val="006030"/>
           <w:sz w:val="22"/>
         </w:rPr>
-        <w:t xml:space="preserve">### ROTA 6 — contrato de pessoa analfabeta declarado nulo, havendo pedido de dano moral. Substitui o bloco "Danos morais" acima, que rejeita. ###</w:t>
+        <w:t xml:space="preserve">### ROTA 6 — contrato de pessoa analfabeta declarado nulo, havendo pedido de dano moral. Substitui o bloco "Danos morais" acima, que rejeita. O último parágrafo ("Os autos atestam") entra sempre, depois da conclusão sobre o valor da indenização. Em "Os autos atestam", R$ [[[___]]] é o prejuízo efetivo não prescrito: soma dos descontos/ cobranças comprovados nos autos e não alcançados pela prescrição, MENOS o valor creditado em conta da parte autora que será compensado (D3), com o valor por extenso. ###</w:t>
       </w:r>
     </w:p>
     <w:p>
@@ -2352,6 +2368,22 @@
           <w:sz w:val="24"/>
         </w:rPr>
         <w:t xml:space="preserve">Por conseguinte, conforme esta jurisprudência de caso similar estabeleceu, também aqui se conclui que “o valor da indenização por danos morais fixado em R$ 2.000,00 observa os princípios da razoabilidade e proporcionalidade, considerando a extensão do dano, o caráter alimentar do benefício atingido e a condição econômica das partes”.</w:t>
+      </w:r>
+    </w:p>
+    <w:p>
+      <w:pPr>
+        <w:spacing w:before="0" w:after="0" w:line="360" w:lineRule="auto"/>
+        <w:ind w:firstLine="709" w:left="0"/>
+        <w:jc w:val="both"/>
+      </w:pPr>
+      <w:r>
+        <w:rPr>
+          <w:rFonts w:ascii="Times New Roman" w:hAnsi="Times New Roman"/>
+          <w:b w:val="0"/>
+          <w:color w:val="000000"/>
+          <w:sz w:val="24"/>
+        </w:rPr>
+        <w:t>Os autos atestam, precipuamente, um prejuízo de R$ [[[___]]] ([[[valor por extenso]]]), a ser contabilizado em liquidação.</w:t>
       </w:r>
     </w:p>
     <w:p>

</xml_diff>

<commit_message>
Modelo: parágrafo para registrar a intimação e os documentos insuficientes do réu
No módulo "Da não formalização do negócio jurídico", entre "Nota-se..." e
"Por essas constatações...", entram uma instrução ### e um parágrafo com
campos para registrar, em linguagem formal e com Id: a ordem para juntar o
contrato e a resposta do réu, o documento anunciado e não juntado, e os
documentos acostados que não provam a contratação.

Co-Authored-By: Claude Opus 5.5 <noreply@anthropic.com>
Claude-Session: https://claude.ai/code/session_013QDNUXax2KcndW1CBsMGWB
</commit_message>
<xml_diff>
--- a/MODELO UNIVERSAL - PROTOTIPO GERAL.docx
+++ b/MODELO UNIVERSAL - PROTOTIPO GERAL.docx
@@ -1277,6 +1277,57 @@
           <w:lang w:val="pt-BR"/>
         </w:rPr>
         <w:t xml:space="preserve">Nota-se que a parte requerida não juntou aos autos virtuais documentação capaz de comprovar a realização da contratação questionada em juízo, não se desincumbindo do ônus que lhe impõe a atividade probatória nesta seara. </w:t>
+      </w:r>
+    </w:p>
+    <w:p>
+      <w:pPr>
+        <w:spacing w:line="360" w:lineRule="auto"/>
+        <w:jc w:val="both"/>
+        <w:rPr>
+          <w:lang w:val="pt-BR"/>
+        </w:rPr>
+      </w:pPr>
+    </w:p>
+    <w:p>
+      <w:pPr>
+        <w:spacing w:line="240" w:lineRule="auto"/>
+        <w:jc w:val="both"/>
+        <w:rPr>
+          <w:lang w:val="pt-BR"/>
+        </w:rPr>
+      </w:pPr>
+      <w:r>
+        <w:rPr>
+          <w:color w:val="006030"/>
+          <w:sz w:val="22"/>
+          <w:lang w:val="pt-BR"/>
+        </w:rPr>
+        <w:t xml:space="preserve">### Parágrafo seguinte — registre, sempre com o Id do PJe: (1) a ordem judicial para que a parte requerida juntasse o contrato ou a autorização dos descontos (despacho, decisão, carta de citação ou ato ordinatório) e o que ela fez diante da ordem; (2) o documento que a contestação afirma ter anexado e que não veio, se for o caso; (3) cada documento que a parte requerida efetivamente juntou e que não prova a contratação. Designe os documentos em linguagem formal, por exemplo: "tabela genérica de tarifas", "extratos bancários", "registro de comunicações extraído de seu sistema interno", "reprodução de telas de sistema", "material publicitário do produto", "condições gerais do produto, sem identificação da parte autora", "atos constitutivos e instrumentos de mandato". Apague as frases que não se aplicarem, ajustando só vírgula e conectivo. Não use linguagem coloquial (ex.: "o réu juntou só", "pelo critério do Juiz"). Prova positiva do contrário (log não visualizado, termo de não adesão) não entra aqui: vai no bloco "Pelo contrário, aliás", logo abaixo. ###</w:t>
+      </w:r>
+    </w:p>
+    <w:p>
+      <w:pPr>
+        <w:spacing w:line="360" w:lineRule="auto"/>
+        <w:jc w:val="both"/>
+        <w:rPr>
+          <w:lang w:val="pt-BR"/>
+        </w:rPr>
+      </w:pPr>
+    </w:p>
+    <w:p>
+      <w:pPr>
+        <w:spacing w:line="360" w:lineRule="auto"/>
+        <w:ind w:firstLine="709"/>
+        <w:jc w:val="both"/>
+        <w:rPr>
+          <w:lang w:val="pt-BR"/>
+        </w:rPr>
+      </w:pPr>
+      <w:r>
+        <w:rPr>
+          <w:lang w:val="pt-BR"/>
+        </w:rPr>
+        <w:t xml:space="preserve">[[[Registre-se que, intimada a apresentar o instrumento contratual ou documento comprobatório da autorização dos descontos (Id. ___), a parte requerida [[[deixou transcorrer o prazo sem manifestação (Id. ___)/ limitou-se a ratificar os termos da contestação (Id. ___)/ não o apresentou]]].]]] [[[Embora a contestação (Id. ___) faça referência a [[[contrato/ termo de adesão/ proposta de adesão]]] que estaria anexo, tal documento não acompanhou a peça.]]] [[[Os documentos efetivamente acostados pela parte demandada — [[[tabela genérica de tarifas (Id. ___), extratos bancários (Id. ___) e registro de comunicações extraído de seu sistema interno (Id. ___)]]] — não se prestam a comprovar a contratação, porquanto neles não se identifica assinatura, adesão ou qualquer outra manifestação de vontade da parte autora quanto ao produto questionado./ A parte demandada não acostou aos autos documento algum relativo à contratação.]]]</w:t>
       </w:r>
     </w:p>
     <w:p>

</xml_diff>